<commit_message>
docs: sesuaikan naskah uji — CAPTCHA dinonaktifkan
- Login aktif tanpa reCAPTCHA (CAPTCHA_DISABLED=true)
- Hapus/ganti skenario captcha di black box & checklist Word
- Deskripsi sistem + BAB 4 + activity login diselaraskan
</commit_message>
<xml_diff>
--- a/CHECKLIST_DEMO_BLACKBOX.docx
+++ b/CHECKLIST_DEMO_BLACKBOX.docx
@@ -64,6 +64,21 @@
     </w:p>
     <w:p>
       <w:pPr>
+        <w:spacing w:after="80" w:before="40" w:line="276" w:lineRule="auto"/>
+        <w:jc w:val="center"/>
+      </w:pPr>
+      <w:r>
+        <w:rPr>
+          <w:rFonts w:ascii="Times New Roman" w:hAnsi="Times New Roman" w:eastAsia="Times New Roman"/>
+          <w:b w:val="0"/>
+          <w:i/>
+          <w:sz w:val="20"/>
+        </w:rPr>
+        <w:t>Catatan: CAPTCHA/reCAPTCHA DINONAKTIFKAN pada environment aktif (CAPTCHA_DISABLED=true). Login hanya email + password.</w:t>
+      </w:r>
+    </w:p>
+    <w:p>
+      <w:pPr>
         <w:spacing w:after="120" w:before="240" w:line="276" w:lineRule="auto"/>
       </w:pPr>
       <w:r>
@@ -84,8 +99,8 @@
         <w:tblLook w:firstColumn="1" w:firstRow="1" w:lastColumn="0" w:lastRow="0" w:noHBand="0" w:noVBand="1" w:val="04A0"/>
       </w:tblPr>
       <w:tblGrid>
-        <w:gridCol w:w="4819"/>
-        <w:gridCol w:w="4819"/>
+        <w:gridCol w:w="4986"/>
+        <w:gridCol w:w="4986"/>
       </w:tblGrid>
       <w:tr>
         <w:tc>
@@ -434,7 +449,7 @@
           <w:i w:val="0"/>
           <w:sz w:val="22"/>
         </w:rPr>
-        <w:t>☐  CAPTCHA lingkungan uji siap</w:t>
+        <w:t>☐  Login tanpa CAPTCHA (sesuai environment aktif)</w:t>
       </w:r>
     </w:p>
     <w:p>
@@ -459,10 +474,10 @@
         <w:tblLook w:firstColumn="1" w:firstRow="1" w:lastColumn="0" w:lastRow="0" w:noHBand="0" w:noVBand="1" w:val="04A0"/>
       </w:tblPr>
       <w:tblGrid>
-        <w:gridCol w:w="2409"/>
-        <w:gridCol w:w="2409"/>
-        <w:gridCol w:w="2409"/>
-        <w:gridCol w:w="2409"/>
+        <w:gridCol w:w="2493"/>
+        <w:gridCol w:w="2493"/>
+        <w:gridCol w:w="2493"/>
+        <w:gridCol w:w="2493"/>
       </w:tblGrid>
       <w:tr>
         <w:tc>
@@ -1416,9 +1431,9 @@
         <w:tblLook w:firstColumn="1" w:firstRow="1" w:lastColumn="0" w:lastRow="0" w:noHBand="0" w:noVBand="1" w:val="04A0"/>
       </w:tblPr>
       <w:tblGrid>
-        <w:gridCol w:w="3213"/>
-        <w:gridCol w:w="3213"/>
-        <w:gridCol w:w="3213"/>
+        <w:gridCol w:w="3324"/>
+        <w:gridCol w:w="3324"/>
+        <w:gridCol w:w="3324"/>
       </w:tblGrid>
       <w:tr>
         <w:tc>
@@ -1767,7 +1782,7 @@
           <w:i/>
           <w:sz w:val="20"/>
         </w:rPr>
-        <w:t>Isi kolom Hasil aktual, Status (L/TL/B), dan Catatan saat pengujian.</w:t>
+        <w:t>Isi kolom Hasil aktual, Status (L/TL/B), dan Catatan saat pengujian. Tidak ada kasus CAPTCHA karena fitur dinonaktifkan.</w:t>
       </w:r>
     </w:p>
     <w:p>
@@ -1792,12 +1807,12 @@
         <w:tblLook w:firstColumn="1" w:firstRow="1" w:lastColumn="0" w:lastRow="0" w:noHBand="0" w:noVBand="1" w:val="04A0"/>
       </w:tblPr>
       <w:tblGrid>
-        <w:gridCol w:w="1606"/>
-        <w:gridCol w:w="1606"/>
-        <w:gridCol w:w="1606"/>
-        <w:gridCol w:w="1606"/>
-        <w:gridCol w:w="1606"/>
-        <w:gridCol w:w="1606"/>
+        <w:gridCol w:w="1662"/>
+        <w:gridCol w:w="1662"/>
+        <w:gridCol w:w="1662"/>
+        <w:gridCol w:w="1662"/>
+        <w:gridCol w:w="1662"/>
+        <w:gridCol w:w="1662"/>
       </w:tblGrid>
       <w:tr>
         <w:tc>
@@ -2564,7 +2579,7 @@
                 <w:i w:val="0"/>
                 <w:sz w:val="16"/>
               </w:rPr>
-              <w:t>CAPTCHA tidak valid</w:t>
+              <w:t>Login gagal berulang (opsional)</w:t>
             </w:r>
           </w:p>
         </w:tc>
@@ -2581,7 +2596,7 @@
                 <w:i w:val="0"/>
                 <w:sz w:val="16"/>
               </w:rPr>
-              <w:t>Ditolak</w:t>
+              <w:t>Rate limit / tetap ditolak</w:t>
             </w:r>
           </w:p>
         </w:tc>
@@ -2773,12 +2788,12 @@
         <w:tblLook w:firstColumn="1" w:firstRow="1" w:lastColumn="0" w:lastRow="0" w:noHBand="0" w:noVBand="1" w:val="04A0"/>
       </w:tblPr>
       <w:tblGrid>
-        <w:gridCol w:w="1606"/>
-        <w:gridCol w:w="1606"/>
-        <w:gridCol w:w="1606"/>
-        <w:gridCol w:w="1606"/>
-        <w:gridCol w:w="1606"/>
-        <w:gridCol w:w="1606"/>
+        <w:gridCol w:w="1662"/>
+        <w:gridCol w:w="1662"/>
+        <w:gridCol w:w="1662"/>
+        <w:gridCol w:w="1662"/>
+        <w:gridCol w:w="1662"/>
+        <w:gridCol w:w="1662"/>
       </w:tblGrid>
       <w:tr>
         <w:tc>
@@ -3552,12 +3567,12 @@
         <w:tblLook w:firstColumn="1" w:firstRow="1" w:lastColumn="0" w:lastRow="0" w:noHBand="0" w:noVBand="1" w:val="04A0"/>
       </w:tblPr>
       <w:tblGrid>
-        <w:gridCol w:w="1606"/>
-        <w:gridCol w:w="1606"/>
-        <w:gridCol w:w="1606"/>
-        <w:gridCol w:w="1606"/>
-        <w:gridCol w:w="1606"/>
-        <w:gridCol w:w="1606"/>
+        <w:gridCol w:w="1662"/>
+        <w:gridCol w:w="1662"/>
+        <w:gridCol w:w="1662"/>
+        <w:gridCol w:w="1662"/>
+        <w:gridCol w:w="1662"/>
+        <w:gridCol w:w="1662"/>
       </w:tblGrid>
       <w:tr>
         <w:tc>
@@ -4836,12 +4851,12 @@
         <w:tblLook w:firstColumn="1" w:firstRow="1" w:lastColumn="0" w:lastRow="0" w:noHBand="0" w:noVBand="1" w:val="04A0"/>
       </w:tblPr>
       <w:tblGrid>
-        <w:gridCol w:w="1606"/>
-        <w:gridCol w:w="1606"/>
-        <w:gridCol w:w="1606"/>
-        <w:gridCol w:w="1606"/>
-        <w:gridCol w:w="1606"/>
-        <w:gridCol w:w="1606"/>
+        <w:gridCol w:w="1662"/>
+        <w:gridCol w:w="1662"/>
+        <w:gridCol w:w="1662"/>
+        <w:gridCol w:w="1662"/>
+        <w:gridCol w:w="1662"/>
+        <w:gridCol w:w="1662"/>
       </w:tblGrid>
       <w:tr>
         <w:tc>
@@ -5514,12 +5529,12 @@
         <w:tblLook w:firstColumn="1" w:firstRow="1" w:lastColumn="0" w:lastRow="0" w:noHBand="0" w:noVBand="1" w:val="04A0"/>
       </w:tblPr>
       <w:tblGrid>
-        <w:gridCol w:w="1606"/>
-        <w:gridCol w:w="1606"/>
-        <w:gridCol w:w="1606"/>
-        <w:gridCol w:w="1606"/>
-        <w:gridCol w:w="1606"/>
-        <w:gridCol w:w="1606"/>
+        <w:gridCol w:w="1662"/>
+        <w:gridCol w:w="1662"/>
+        <w:gridCol w:w="1662"/>
+        <w:gridCol w:w="1662"/>
+        <w:gridCol w:w="1662"/>
+        <w:gridCol w:w="1662"/>
       </w:tblGrid>
       <w:tr>
         <w:tc>
@@ -6163,20 +6178,6 @@
           <w:sz w:val="20"/>
         </w:rPr>
         <w:t>Rumus ketat: % Lulus = L / Total × 100%</w:t>
-      </w:r>
-    </w:p>
-    <w:p>
-      <w:pPr>
-        <w:spacing w:after="80" w:before="40" w:line="276" w:lineRule="auto"/>
-      </w:pPr>
-      <w:r>
-        <w:rPr>
-          <w:rFonts w:ascii="Times New Roman" w:hAnsi="Times New Roman" w:eastAsia="Times New Roman"/>
-          <w:b w:val="0"/>
-          <w:i w:val="0"/>
-          <w:sz w:val="20"/>
-        </w:rPr>
-        <w:t>Rumus longgar (opsional): % Lulus = (L + 0,5×B) / Total × 100%</w:t>
       </w:r>
     </w:p>
     <w:p>
@@ -6201,8 +6202,8 @@
         <w:tblLook w:firstColumn="1" w:firstRow="1" w:lastColumn="0" w:lastRow="0" w:noHBand="0" w:noVBand="1" w:val="04A0"/>
       </w:tblPr>
       <w:tblGrid>
-        <w:gridCol w:w="4819"/>
-        <w:gridCol w:w="4819"/>
+        <w:gridCol w:w="4986"/>
+        <w:gridCol w:w="4986"/>
       </w:tblGrid>
       <w:tr>
         <w:tc>
@@ -6447,11 +6448,11 @@
         <w:tblLook w:firstColumn="1" w:firstRow="1" w:lastColumn="0" w:lastRow="0" w:noHBand="0" w:noVBand="1" w:val="04A0"/>
       </w:tblPr>
       <w:tblGrid>
-        <w:gridCol w:w="1928"/>
-        <w:gridCol w:w="1928"/>
-        <w:gridCol w:w="1928"/>
-        <w:gridCol w:w="1928"/>
-        <w:gridCol w:w="1928"/>
+        <w:gridCol w:w="1994"/>
+        <w:gridCol w:w="1994"/>
+        <w:gridCol w:w="1994"/>
+        <w:gridCol w:w="1994"/>
+        <w:gridCol w:w="1994"/>
       </w:tblGrid>
       <w:tr>
         <w:tc>
@@ -6928,24 +6929,10 @@
         <w:rPr>
           <w:rFonts w:ascii="Times New Roman" w:hAnsi="Times New Roman" w:eastAsia="Times New Roman"/>
           <w:b w:val="0"/>
-          <w:i/>
-          <w:sz w:val="20"/>
-        </w:rPr>
-        <w:t>Salin lalu ganti angka setelah uji selesai:</w:t>
-      </w:r>
-    </w:p>
-    <w:p>
-      <w:pPr>
-        <w:spacing w:after="80" w:before="40" w:line="276" w:lineRule="auto"/>
-      </w:pPr>
-      <w:r>
-        <w:rPr>
-          <w:rFonts w:ascii="Times New Roman" w:hAnsi="Times New Roman" w:eastAsia="Times New Roman"/>
-          <w:b w:val="0"/>
           <w:i w:val="0"/>
           <w:sz w:val="20"/>
         </w:rPr>
-        <w:t>Pengujian fungsional menggunakan metode Black Box Testing dengan teknik ECP, BVA, dan Error Guessing. Sebanyak 30 kasus uji dijalankan pada modul autentikasi, tabungan, pinjaman kelompok, laporan, dan batasan scope. Hasil rekap menunjukkan ___ kasus lulus (___%), ___ tidak lulus, dan ___ bug minor. Temuan utama kemudian ditindaklanjuti pada tahap revisi produk sesuai siklus R&amp;D.</w:t>
+        <w:t>Pengujian fungsional menggunakan metode Black Box Testing dengan teknik ECP, BVA, dan Error Guessing. Sebanyak 30 kasus uji dijalankan pada modul autentikasi (tanpa CAPTCHA), tabungan, pinjaman kelompok, laporan, dan batasan scope. Hasil rekap menunjukkan ___ kasus lulus (___%), ___ tidak lulus, dan ___ bug minor. Temuan utama kemudian ditindaklanjuti pada tahap revisi produk sesuai siklus R&amp;D.</w:t>
       </w:r>
     </w:p>
     <w:p>
@@ -6970,9 +6957,9 @@
         <w:tblLook w:firstColumn="1" w:firstRow="1" w:lastColumn="0" w:lastRow="0" w:noHBand="0" w:noVBand="1" w:val="04A0"/>
       </w:tblPr>
       <w:tblGrid>
-        <w:gridCol w:w="3213"/>
-        <w:gridCol w:w="3213"/>
-        <w:gridCol w:w="3213"/>
+        <w:gridCol w:w="3324"/>
+        <w:gridCol w:w="3324"/>
+        <w:gridCol w:w="3324"/>
       </w:tblGrid>
       <w:tr>
         <w:tc>
@@ -7297,37 +7284,8 @@
       </w:tr>
     </w:tbl>
     <w:p/>
-    <w:p>
-      <w:pPr>
-        <w:spacing w:after="80" w:before="40" w:line="276" w:lineRule="auto"/>
-      </w:pPr>
-      <w:r>
-        <w:rPr>
-          <w:rFonts w:ascii="Times New Roman" w:hAnsi="Times New Roman" w:eastAsia="Times New Roman"/>
-          <w:b w:val="0"/>
-          <w:i/>
-          <w:sz w:val="18"/>
-        </w:rPr>
-        <w:t>File terkait: BLACK_BOX_UAT_TESTING.md | PANDUAN_DAN_FORM_PENGUJIAN.md | BAB_4_HASIL_DAN_PEMBAHASAN.md</w:t>
-      </w:r>
-    </w:p>
-    <w:p>
-      <w:pPr>
-        <w:spacing w:after="80" w:before="40" w:line="276" w:lineRule="auto"/>
-        <w:jc w:val="center"/>
-      </w:pPr>
-      <w:r>
-        <w:rPr>
-          <w:rFonts w:ascii="Times New Roman" w:hAnsi="Times New Roman" w:eastAsia="Times New Roman"/>
-          <w:b w:val="0"/>
-          <w:i/>
-          <w:sz w:val="18"/>
-        </w:rPr>
-        <w:t>Generate otomatis untuk uji lapangan skripsi Karya Tantri Abadi.</w:t>
-      </w:r>
-    </w:p>
     <w:sectPr>
-      <w:pgSz w:w="11906" w:h="16838"/>
+      <w:pgSz w:w="12240" w:h="15840"/>
       <w:pgMar w:top="1020" w:right="1134" w:bottom="1020" w:left="1134" w:header="720" w:footer="720" w:gutter="0"/>
       <w:cols w:space="720"/>
       <w:docGrid w:linePitch="360"/>

</xml_diff>

<commit_message>
docs: tambah keterangan pengisi checklist demo/black box
- Dokumen diisi peneliti; mitra mengoperasikan sistem
- UAT tetap diisi mitra di form terpisah
</commit_message>
<xml_diff>
--- a/CHECKLIST_DEMO_BLACKBOX.docx
+++ b/CHECKLIST_DEMO_BLACKBOX.docx
@@ -74,7 +74,273 @@
           <w:i/>
           <w:sz w:val="20"/>
         </w:rPr>
-        <w:t>Catatan: CAPTCHA/reCAPTCHA DINONAKTIFKAN pada environment aktif (CAPTCHA_DISABLED=true). Login hanya email + password.</w:t>
+        <w:t>CAPTCHA/reCAPTCHA DINONAKTIFKAN (CAPTCHA_DISABLED=true). Login: email + password.</w:t>
+      </w:r>
+    </w:p>
+    <w:p>
+      <w:pPr>
+        <w:spacing w:after="120" w:before="240" w:line="276" w:lineRule="auto"/>
+      </w:pPr>
+      <w:r>
+        <w:rPr>
+          <w:rFonts w:ascii="Times New Roman" w:hAnsi="Times New Roman" w:eastAsia="Times New Roman"/>
+          <w:b/>
+          <w:i w:val="0"/>
+          <w:sz w:val="24"/>
+        </w:rPr>
+        <w:t>Siapa mengisi dokumen ini?</w:t>
+      </w:r>
+    </w:p>
+    <w:tbl>
+      <w:tblPr>
+        <w:tblStyle w:val="TableGrid"/>
+        <w:tblW w:type="auto" w:w="0"/>
+        <w:jc w:val="center"/>
+        <w:tblLook w:firstColumn="1" w:firstRow="1" w:lastColumn="0" w:lastRow="0" w:noHBand="0" w:noVBand="1" w:val="04A0"/>
+      </w:tblPr>
+      <w:tblGrid>
+        <w:gridCol w:w="3324"/>
+        <w:gridCol w:w="3324"/>
+        <w:gridCol w:w="3324"/>
+      </w:tblGrid>
+      <w:tr>
+        <w:tc>
+          <w:tcPr>
+            <w:tcW w:type="dxa" w:w="3118"/>
+            <w:shd w:fill="D9E2F3" w:val="clear"/>
+          </w:tcPr>
+          <w:p>
+            <w:pPr>
+              <w:jc w:val="center"/>
+            </w:pPr>
+            <w:r/>
+            <w:r>
+              <w:rPr>
+                <w:rFonts w:ascii="Times New Roman" w:hAnsi="Times New Roman" w:eastAsia="Times New Roman"/>
+                <w:b/>
+                <w:i w:val="0"/>
+                <w:sz w:val="18"/>
+              </w:rPr>
+              <w:t>Bagian</w:t>
+            </w:r>
+          </w:p>
+        </w:tc>
+        <w:tc>
+          <w:tcPr>
+            <w:tcW w:type="dxa" w:w="3118"/>
+            <w:shd w:fill="D9E2F3" w:val="clear"/>
+          </w:tcPr>
+          <w:p>
+            <w:pPr>
+              <w:jc w:val="center"/>
+            </w:pPr>
+            <w:r/>
+            <w:r>
+              <w:rPr>
+                <w:rFonts w:ascii="Times New Roman" w:hAnsi="Times New Roman" w:eastAsia="Times New Roman"/>
+                <w:b/>
+                <w:i w:val="0"/>
+                <w:sz w:val="18"/>
+              </w:rPr>
+              <w:t>Diisi oleh</w:t>
+            </w:r>
+          </w:p>
+        </w:tc>
+        <w:tc>
+          <w:tcPr>
+            <w:tcW w:type="dxa" w:w="3402"/>
+            <w:shd w:fill="D9E2F3" w:val="clear"/>
+          </w:tcPr>
+          <w:p>
+            <w:pPr>
+              <w:jc w:val="center"/>
+            </w:pPr>
+            <w:r/>
+            <w:r>
+              <w:rPr>
+                <w:rFonts w:ascii="Times New Roman" w:hAnsi="Times New Roman" w:eastAsia="Times New Roman"/>
+                <w:b/>
+                <w:i w:val="0"/>
+                <w:sz w:val="18"/>
+              </w:rPr>
+              <w:t>Peran</w:t>
+            </w:r>
+          </w:p>
+        </w:tc>
+      </w:tr>
+      <w:tr>
+        <w:tc>
+          <w:tcPr>
+            <w:tcW w:type="dxa" w:w="3118"/>
+          </w:tcPr>
+          <w:p>
+            <w:r/>
+            <w:r>
+              <w:rPr>
+                <w:rFonts w:ascii="Times New Roman" w:hAnsi="Times New Roman" w:eastAsia="Times New Roman"/>
+                <w:b w:val="0"/>
+                <w:i w:val="0"/>
+                <w:sz w:val="18"/>
+              </w:rPr>
+              <w:t>Identitas sesi, checklist demo, tabel Black Box, rekap, log R&amp;D</w:t>
+            </w:r>
+          </w:p>
+        </w:tc>
+        <w:tc>
+          <w:tcPr>
+            <w:tcW w:type="dxa" w:w="3118"/>
+          </w:tcPr>
+          <w:p>
+            <w:r/>
+            <w:r>
+              <w:rPr>
+                <w:rFonts w:ascii="Times New Roman" w:hAnsi="Times New Roman" w:eastAsia="Times New Roman"/>
+                <w:b w:val="0"/>
+                <w:i w:val="0"/>
+                <w:sz w:val="18"/>
+              </w:rPr>
+              <w:t>Peneliti (Adrian Akbar Ramadhani)</w:t>
+            </w:r>
+          </w:p>
+        </w:tc>
+        <w:tc>
+          <w:tcPr>
+            <w:tcW w:type="dxa" w:w="3402"/>
+          </w:tcPr>
+          <w:p>
+            <w:r/>
+            <w:r>
+              <w:rPr>
+                <w:rFonts w:ascii="Times New Roman" w:hAnsi="Times New Roman" w:eastAsia="Times New Roman"/>
+                <w:b w:val="0"/>
+                <w:i w:val="0"/>
+                <w:sz w:val="18"/>
+              </w:rPr>
+              <w:t>Mengamati &amp; mencatat hasil uji fungsional</w:t>
+            </w:r>
+          </w:p>
+        </w:tc>
+      </w:tr>
+      <w:tr>
+        <w:tc>
+          <w:tcPr>
+            <w:tcW w:type="dxa" w:w="3118"/>
+          </w:tcPr>
+          <w:p>
+            <w:r/>
+            <w:r>
+              <w:rPr>
+                <w:rFonts w:ascii="Times New Roman" w:hAnsi="Times New Roman" w:eastAsia="Times New Roman"/>
+                <w:b w:val="0"/>
+                <w:i w:val="0"/>
+                <w:sz w:val="18"/>
+              </w:rPr>
+              <w:t>Operasi sistem saat demo (klik menu, input data)</w:t>
+            </w:r>
+          </w:p>
+        </w:tc>
+        <w:tc>
+          <w:tcPr>
+            <w:tcW w:type="dxa" w:w="3118"/>
+          </w:tcPr>
+          <w:p>
+            <w:r/>
+            <w:r>
+              <w:rPr>
+                <w:rFonts w:ascii="Times New Roman" w:hAnsi="Times New Roman" w:eastAsia="Times New Roman"/>
+                <w:b w:val="0"/>
+                <w:i w:val="0"/>
+                <w:sz w:val="18"/>
+              </w:rPr>
+              <w:t>Mitra (admin/SPV/kasir/anggota)</w:t>
+            </w:r>
+          </w:p>
+        </w:tc>
+        <w:tc>
+          <w:tcPr>
+            <w:tcW w:type="dxa" w:w="3402"/>
+          </w:tcPr>
+          <w:p>
+            <w:r/>
+            <w:r>
+              <w:rPr>
+                <w:rFonts w:ascii="Times New Roman" w:hAnsi="Times New Roman" w:eastAsia="Times New Roman"/>
+                <w:b w:val="0"/>
+                <w:i w:val="0"/>
+                <w:sz w:val="18"/>
+              </w:rPr>
+              <w:t>Menjalankan alur; BUKAN mengisi tabel black box</w:t>
+            </w:r>
+          </w:p>
+        </w:tc>
+      </w:tr>
+      <w:tr>
+        <w:tc>
+          <w:tcPr>
+            <w:tcW w:type="dxa" w:w="3118"/>
+          </w:tcPr>
+          <w:p>
+            <w:r/>
+            <w:r>
+              <w:rPr>
+                <w:rFonts w:ascii="Times New Roman" w:hAnsi="Times New Roman" w:eastAsia="Times New Roman"/>
+                <w:b w:val="0"/>
+                <w:i w:val="0"/>
+                <w:sz w:val="18"/>
+              </w:rPr>
+              <w:t>Kuesioner UAT + berita acara</w:t>
+            </w:r>
+          </w:p>
+        </w:tc>
+        <w:tc>
+          <w:tcPr>
+            <w:tcW w:type="dxa" w:w="3118"/>
+          </w:tcPr>
+          <w:p>
+            <w:r/>
+            <w:r>
+              <w:rPr>
+                <w:rFonts w:ascii="Times New Roman" w:hAnsi="Times New Roman" w:eastAsia="Times New Roman"/>
+                <w:b w:val="0"/>
+                <w:i w:val="0"/>
+                <w:sz w:val="18"/>
+              </w:rPr>
+              <w:t>Mitra (responden) + peneliti fasilitator</w:t>
+            </w:r>
+          </w:p>
+        </w:tc>
+        <w:tc>
+          <w:tcPr>
+            <w:tcW w:type="dxa" w:w="3402"/>
+          </w:tcPr>
+          <w:p>
+            <w:r/>
+            <w:r>
+              <w:rPr>
+                <w:rFonts w:ascii="Times New Roman" w:hAnsi="Times New Roman" w:eastAsia="Times New Roman"/>
+                <w:b w:val="0"/>
+                <w:i w:val="0"/>
+                <w:sz w:val="18"/>
+              </w:rPr>
+              <w:t>Form terpisah: PANDUAN_DAN_FORM_PENGUJIAN</w:t>
+            </w:r>
+          </w:p>
+        </w:tc>
+      </w:tr>
+    </w:tbl>
+    <w:p/>
+    <w:p>
+      <w:pPr>
+        <w:spacing w:after="80" w:before="40" w:line="276" w:lineRule="auto"/>
+      </w:pPr>
+      <w:r>
+        <w:rPr>
+          <w:rFonts w:ascii="Times New Roman" w:hAnsi="Times New Roman" w:eastAsia="Times New Roman"/>
+          <w:b/>
+          <w:i w:val="0"/>
+          <w:sz w:val="20"/>
+        </w:rPr>
+        <w:t>Ringkas: dokumen ini DIISI OLEH PENELITI. Mitra mengoperasikan sistem; masukan lisan mitra dicatat peneliti di kolom temuan.</w:t>
       </w:r>
     </w:p>
     <w:p>
@@ -91,6 +357,20 @@
         <w:t>0. Identitas Sesi Uji</w:t>
       </w:r>
     </w:p>
+    <w:p>
+      <w:pPr>
+        <w:spacing w:after="80" w:before="40" w:line="276" w:lineRule="auto"/>
+      </w:pPr>
+      <w:r>
+        <w:rPr>
+          <w:rFonts w:ascii="Times New Roman" w:hAnsi="Times New Roman" w:eastAsia="Times New Roman"/>
+          <w:b/>
+          <w:i/>
+          <w:sz w:val="20"/>
+        </w:rPr>
+        <w:t>Diisi oleh: Peneliti</w:t>
+      </w:r>
+    </w:p>
     <w:tbl>
       <w:tblPr>
         <w:tblStyle w:val="TableGrid"/>
@@ -376,6 +656,20 @@
           <w:sz w:val="24"/>
         </w:rPr>
         <w:t>1. Persiapan</w:t>
+      </w:r>
+    </w:p>
+    <w:p>
+      <w:pPr>
+        <w:spacing w:after="80" w:before="40" w:line="276" w:lineRule="auto"/>
+      </w:pPr>
+      <w:r>
+        <w:rPr>
+          <w:rFonts w:ascii="Times New Roman" w:hAnsi="Times New Roman" w:eastAsia="Times New Roman"/>
+          <w:b/>
+          <w:i/>
+          <w:sz w:val="20"/>
+        </w:rPr>
+        <w:t>Diisi oleh: Peneliti</w:t>
       </w:r>
     </w:p>
     <w:p>
@@ -977,6 +1271,20 @@
           <w:sz w:val="24"/>
         </w:rPr>
         <w:t>2. Checklist Demo Alur (15–25 menit)</w:t>
+      </w:r>
+    </w:p>
+    <w:p>
+      <w:pPr>
+        <w:spacing w:after="80" w:before="40" w:line="276" w:lineRule="auto"/>
+      </w:pPr>
+      <w:r>
+        <w:rPr>
+          <w:rFonts w:ascii="Times New Roman" w:hAnsi="Times New Roman" w:eastAsia="Times New Roman"/>
+          <w:b/>
+          <w:i/>
+          <w:sz w:val="20"/>
+        </w:rPr>
+        <w:t>Diisi oleh: Peneliti (sambil/setelah mitra mengoperasikan sistem)</w:t>
       </w:r>
     </w:p>
     <w:p>
@@ -1406,7 +1714,7 @@
           <w:i w:val="0"/>
           <w:sz w:val="22"/>
         </w:rPr>
-        <w:t>☐  Bagikan kuesioner UAT</w:t>
+        <w:t>☐  Bagikan kuesioner UAT (diisi mitra di form terpisah)</w:t>
       </w:r>
     </w:p>
     <w:p>
@@ -1421,6 +1729,20 @@
           <w:sz w:val="22"/>
         </w:rPr>
         <w:t>2.6 Catatan demo</w:t>
+      </w:r>
+    </w:p>
+    <w:p>
+      <w:pPr>
+        <w:spacing w:after="80" w:before="40" w:line="276" w:lineRule="auto"/>
+      </w:pPr>
+      <w:r>
+        <w:rPr>
+          <w:rFonts w:ascii="Times New Roman" w:hAnsi="Times New Roman" w:eastAsia="Times New Roman"/>
+          <w:b w:val="0"/>
+          <w:i/>
+          <w:sz w:val="20"/>
+        </w:rPr>
+        <w:t>Diisi oleh: Peneliti (mencatat masukan lisan mitra)</w:t>
       </w:r>
     </w:p>
     <w:tbl>
@@ -1778,11 +2100,25 @@
       <w:r>
         <w:rPr>
           <w:rFonts w:ascii="Times New Roman" w:hAnsi="Times New Roman" w:eastAsia="Times New Roman"/>
+          <w:b/>
+          <w:i/>
+          <w:sz w:val="20"/>
+        </w:rPr>
+        <w:t>Diisi oleh: PENELITI (bukan mitra). Mitra hanya menjalankan skenario.</w:t>
+      </w:r>
+    </w:p>
+    <w:p>
+      <w:pPr>
+        <w:spacing w:after="80" w:before="40" w:line="276" w:lineRule="auto"/>
+      </w:pPr>
+      <w:r>
+        <w:rPr>
+          <w:rFonts w:ascii="Times New Roman" w:hAnsi="Times New Roman" w:eastAsia="Times New Roman"/>
           <w:b w:val="0"/>
           <w:i/>
           <w:sz w:val="20"/>
         </w:rPr>
-        <w:t>Isi kolom Hasil aktual, Status (L/TL/B), dan Catatan saat pengujian. Tidak ada kasus CAPTCHA karena fitur dinonaktifkan.</w:t>
+        <w:t>Isi kolom Hasil aktual, Status (L/TL/B), dan Catatan saat pengujian. Tidak ada kasus CAPTCHA.</w:t>
       </w:r>
     </w:p>
     <w:p>
@@ -5521,6 +5857,20 @@
         <w:t>4. Rekap Black Box (untuk BAB 4)</w:t>
       </w:r>
     </w:p>
+    <w:p>
+      <w:pPr>
+        <w:spacing w:after="80" w:before="40" w:line="276" w:lineRule="auto"/>
+      </w:pPr>
+      <w:r>
+        <w:rPr>
+          <w:rFonts w:ascii="Times New Roman" w:hAnsi="Times New Roman" w:eastAsia="Times New Roman"/>
+          <w:b/>
+          <w:i/>
+          <w:sz w:val="20"/>
+        </w:rPr>
+        <w:t>Diisi oleh: Peneliti</w:t>
+      </w:r>
+    </w:p>
     <w:tbl>
       <w:tblPr>
         <w:tblStyle w:val="TableGrid"/>
@@ -6194,6 +6544,20 @@
         <w:t>4.1 Temuan utama</w:t>
       </w:r>
     </w:p>
+    <w:p>
+      <w:pPr>
+        <w:spacing w:after="80" w:before="40" w:line="276" w:lineRule="auto"/>
+      </w:pPr>
+      <w:r>
+        <w:rPr>
+          <w:rFonts w:ascii="Times New Roman" w:hAnsi="Times New Roman" w:eastAsia="Times New Roman"/>
+          <w:b w:val="0"/>
+          <w:i/>
+          <w:sz w:val="20"/>
+        </w:rPr>
+        <w:t>Diisi oleh: Peneliti</w:t>
+      </w:r>
+    </w:p>
     <w:tbl>
       <w:tblPr>
         <w:tblStyle w:val="TableGrid"/>
@@ -6438,6 +6802,20 @@
           <w:sz w:val="22"/>
         </w:rPr>
         <w:t>4.2 Mapping 3 siklus R&amp;D (log revisi)</w:t>
+      </w:r>
+    </w:p>
+    <w:p>
+      <w:pPr>
+        <w:spacing w:after="80" w:before="40" w:line="276" w:lineRule="auto"/>
+      </w:pPr>
+      <w:r>
+        <w:rPr>
+          <w:rFonts w:ascii="Times New Roman" w:hAnsi="Times New Roman" w:eastAsia="Times New Roman"/>
+          <w:b w:val="0"/>
+          <w:i/>
+          <w:sz w:val="20"/>
+        </w:rPr>
+        <w:t>Diisi oleh: Peneliti</w:t>
       </w:r>
     </w:p>
     <w:tbl>
@@ -6834,17 +7212,16 @@
     </w:p>
     <w:p>
       <w:pPr>
-        <w:spacing w:after="40"/>
-        <w:ind w:left="170"/>
+        <w:spacing w:after="80" w:before="40" w:line="276" w:lineRule="auto"/>
       </w:pPr>
       <w:r>
         <w:rPr>
           <w:rFonts w:ascii="Times New Roman" w:hAnsi="Times New Roman" w:eastAsia="Times New Roman"/>
-          <w:b w:val="0"/>
-          <w:i w:val="0"/>
-          <w:sz w:val="22"/>
+          <w:b/>
+          <w:i/>
+          <w:sz w:val="20"/>
         </w:rPr>
-        <w:t>☐  Isi kuesioner UAT (PANDUAN_DAN_FORM_PENGUJIAN)</w:t>
+        <w:t>UAT diisi MITRA (responden). Peneliti memfasilitasi &amp; merekap.</w:t>
       </w:r>
     </w:p>
     <w:p>
@@ -6859,7 +7236,7 @@
           <w:i w:val="0"/>
           <w:sz w:val="22"/>
         </w:rPr>
-        <w:t>☐  Isi berita acara UAT</w:t>
+        <w:t>☐  Isi kuesioner UAT oleh mitra (PANDUAN_DAN_FORM_PENGUJIAN)</w:t>
       </w:r>
     </w:p>
     <w:p>
@@ -6874,7 +7251,7 @@
           <w:i w:val="0"/>
           <w:sz w:val="22"/>
         </w:rPr>
-        <w:t>☐  Ambil screenshot bukti (login role, fee, jadwal cicilan, panel anggota)</w:t>
+        <w:t>☐  Isi berita acara UAT (mitra tanda tangan / peneliti fasilitator)</w:t>
       </w:r>
     </w:p>
     <w:p>
@@ -6889,7 +7266,7 @@
           <w:i w:val="0"/>
           <w:sz w:val="22"/>
         </w:rPr>
-        <w:t>☐  Pindahkan rekap ke BAB 4 (4.1.8)</w:t>
+        <w:t>☐  Ambil screenshot bukti (login role, fee, jadwal cicilan, panel anggota) — peneliti</w:t>
       </w:r>
     </w:p>
     <w:p>
@@ -6904,7 +7281,22 @@
           <w:i w:val="0"/>
           <w:sz w:val="22"/>
         </w:rPr>
-        <w:t>☐  TL/bug masuk daftar Final Product Revision</w:t>
+        <w:t>☐  Pindahkan rekap black box ke BAB 4 (4.1.8) — peneliti</w:t>
+      </w:r>
+    </w:p>
+    <w:p>
+      <w:pPr>
+        <w:spacing w:after="40"/>
+        <w:ind w:left="170"/>
+      </w:pPr>
+      <w:r>
+        <w:rPr>
+          <w:rFonts w:ascii="Times New Roman" w:hAnsi="Times New Roman" w:eastAsia="Times New Roman"/>
+          <w:b w:val="0"/>
+          <w:i w:val="0"/>
+          <w:sz w:val="22"/>
+        </w:rPr>
+        <w:t>☐  TL/bug masuk daftar Final Product Revision — peneliti</w:t>
       </w:r>
     </w:p>
     <w:p>
@@ -6949,6 +7341,20 @@
         <w:t>7. Tanda tangan ringkas</w:t>
       </w:r>
     </w:p>
+    <w:p>
+      <w:pPr>
+        <w:spacing w:after="80" w:before="40" w:line="276" w:lineRule="auto"/>
+      </w:pPr>
+      <w:r>
+        <w:rPr>
+          <w:rFonts w:ascii="Times New Roman" w:hAnsi="Times New Roman" w:eastAsia="Times New Roman"/>
+          <w:b w:val="0"/>
+          <w:i/>
+          <w:sz w:val="20"/>
+        </w:rPr>
+        <w:t>Peneliti mengisi form black box. Mitra menandatangani sebagai saksi/peserta demo (opsional).</w:t>
+      </w:r>
+    </w:p>
     <w:tbl>
       <w:tblPr>
         <w:tblStyle w:val="TableGrid"/>
@@ -6964,7 +7370,7 @@
       <w:tr>
         <w:tc>
           <w:tcPr>
-            <w:tcW w:type="dxa" w:w="2268"/>
+            <w:tcW w:type="dxa" w:w="3118"/>
             <w:shd w:fill="D9E2F3" w:val="clear"/>
           </w:tcPr>
           <w:p>
@@ -6985,7 +7391,7 @@
         </w:tc>
         <w:tc>
           <w:tcPr>
-            <w:tcW w:type="dxa" w:w="3685"/>
+            <w:tcW w:type="dxa" w:w="3118"/>
             <w:shd w:fill="D9E2F3" w:val="clear"/>
           </w:tcPr>
           <w:p>
@@ -7006,7 +7412,7 @@
         </w:tc>
         <w:tc>
           <w:tcPr>
-            <w:tcW w:type="dxa" w:w="3685"/>
+            <w:tcW w:type="dxa" w:w="3402"/>
             <w:shd w:fill="D9E2F3" w:val="clear"/>
           </w:tcPr>
           <w:p>
@@ -7029,7 +7435,7 @@
       <w:tr>
         <w:tc>
           <w:tcPr>
-            <w:tcW w:type="dxa" w:w="2268"/>
+            <w:tcW w:type="dxa" w:w="3118"/>
           </w:tcPr>
           <w:p>
             <w:r/>
@@ -7040,13 +7446,13 @@
                 <w:i w:val="0"/>
                 <w:sz w:val="20"/>
               </w:rPr>
-              <w:t>Peneliti</w:t>
-            </w:r>
-          </w:p>
-        </w:tc>
-        <w:tc>
-          <w:tcPr>
-            <w:tcW w:type="dxa" w:w="3685"/>
+              <w:t>Peneliti (pengisi black box)</w:t>
+            </w:r>
+          </w:p>
+        </w:tc>
+        <w:tc>
+          <w:tcPr>
+            <w:tcW w:type="dxa" w:w="3118"/>
           </w:tcPr>
           <w:p>
             <w:r/>
@@ -7063,7 +7469,7 @@
         </w:tc>
         <w:tc>
           <w:tcPr>
-            <w:tcW w:type="dxa" w:w="3685"/>
+            <w:tcW w:type="dxa" w:w="3402"/>
           </w:tcPr>
           <w:p>
             <w:r/>
@@ -7081,7 +7487,7 @@
       <w:tr>
         <w:tc>
           <w:tcPr>
-            <w:tcW w:type="dxa" w:w="2268"/>
+            <w:tcW w:type="dxa" w:w="3118"/>
           </w:tcPr>
           <w:p>
             <w:r/>
@@ -7092,13 +7498,13 @@
                 <w:i w:val="0"/>
                 <w:sz w:val="20"/>
               </w:rPr>
-              <w:t>Admin mitra</w:t>
-            </w:r>
-          </w:p>
-        </w:tc>
-        <w:tc>
-          <w:tcPr>
-            <w:tcW w:type="dxa" w:w="3685"/>
+              <w:t>Admin mitra (peserta demo)</w:t>
+            </w:r>
+          </w:p>
+        </w:tc>
+        <w:tc>
+          <w:tcPr>
+            <w:tcW w:type="dxa" w:w="3118"/>
           </w:tcPr>
           <w:p>
             <w:r/>
@@ -7114,7 +7520,7 @@
         </w:tc>
         <w:tc>
           <w:tcPr>
-            <w:tcW w:type="dxa" w:w="3685"/>
+            <w:tcW w:type="dxa" w:w="3402"/>
           </w:tcPr>
           <w:p>
             <w:r/>
@@ -7132,7 +7538,7 @@
       <w:tr>
         <w:tc>
           <w:tcPr>
-            <w:tcW w:type="dxa" w:w="2268"/>
+            <w:tcW w:type="dxa" w:w="3118"/>
           </w:tcPr>
           <w:p>
             <w:r/>
@@ -7143,13 +7549,13 @@
                 <w:i w:val="0"/>
                 <w:sz w:val="20"/>
               </w:rPr>
-              <w:t>SPV / pengelola</w:t>
-            </w:r>
-          </w:p>
-        </w:tc>
-        <w:tc>
-          <w:tcPr>
-            <w:tcW w:type="dxa" w:w="3685"/>
+              <w:t>SPV / pengelola (peserta demo)</w:t>
+            </w:r>
+          </w:p>
+        </w:tc>
+        <w:tc>
+          <w:tcPr>
+            <w:tcW w:type="dxa" w:w="3118"/>
           </w:tcPr>
           <w:p>
             <w:r/>
@@ -7165,7 +7571,7 @@
         </w:tc>
         <w:tc>
           <w:tcPr>
-            <w:tcW w:type="dxa" w:w="3685"/>
+            <w:tcW w:type="dxa" w:w="3402"/>
           </w:tcPr>
           <w:p>
             <w:r/>
@@ -7183,7 +7589,7 @@
       <w:tr>
         <w:tc>
           <w:tcPr>
-            <w:tcW w:type="dxa" w:w="2268"/>
+            <w:tcW w:type="dxa" w:w="3118"/>
           </w:tcPr>
           <w:p>
             <w:r/>
@@ -7194,13 +7600,13 @@
                 <w:i w:val="0"/>
                 <w:sz w:val="20"/>
               </w:rPr>
-              <w:t>Kasir</w:t>
-            </w:r>
-          </w:p>
-        </w:tc>
-        <w:tc>
-          <w:tcPr>
-            <w:tcW w:type="dxa" w:w="3685"/>
+              <w:t>Kasir (peserta demo)</w:t>
+            </w:r>
+          </w:p>
+        </w:tc>
+        <w:tc>
+          <w:tcPr>
+            <w:tcW w:type="dxa" w:w="3118"/>
           </w:tcPr>
           <w:p>
             <w:r/>
@@ -7216,7 +7622,7 @@
         </w:tc>
         <w:tc>
           <w:tcPr>
-            <w:tcW w:type="dxa" w:w="3685"/>
+            <w:tcW w:type="dxa" w:w="3402"/>
           </w:tcPr>
           <w:p>
             <w:r/>
@@ -7234,7 +7640,7 @@
       <w:tr>
         <w:tc>
           <w:tcPr>
-            <w:tcW w:type="dxa" w:w="2268"/>
+            <w:tcW w:type="dxa" w:w="3118"/>
           </w:tcPr>
           <w:p>
             <w:r/>
@@ -7245,13 +7651,13 @@
                 <w:i w:val="0"/>
                 <w:sz w:val="20"/>
               </w:rPr>
-              <w:t>Anggota</w:t>
-            </w:r>
-          </w:p>
-        </w:tc>
-        <w:tc>
-          <w:tcPr>
-            <w:tcW w:type="dxa" w:w="3685"/>
+              <w:t>Anggota (peserta demo)</w:t>
+            </w:r>
+          </w:p>
+        </w:tc>
+        <w:tc>
+          <w:tcPr>
+            <w:tcW w:type="dxa" w:w="3118"/>
           </w:tcPr>
           <w:p>
             <w:r/>
@@ -7267,7 +7673,7 @@
         </w:tc>
         <w:tc>
           <w:tcPr>
-            <w:tcW w:type="dxa" w:w="3685"/>
+            <w:tcW w:type="dxa" w:w="3402"/>
           </w:tcPr>
           <w:p>
             <w:r/>

</xml_diff>

<commit_message>
docs: tempel rekap black box 36/36 ke BAB 4
Sertakan fee tier, hasil sesi reset DB, form checklist, dan screenshot UI fee.
</commit_message>
<xml_diff>
--- a/CHECKLIST_DEMO_BLACKBOX.docx
+++ b/CHECKLIST_DEMO_BLACKBOX.docx
@@ -1226,7 +1226,7 @@
           <w:i/>
           <w:sz w:val="20"/>
         </w:rPr>
-        <w:t>Harapan hitung pinjaman A: cair Rp730.000 | total dilunasi Rp1.110.000 | 12 cicilan</w:t>
+        <w:t>Harapan hitung pinjaman A 1jt: UTJ 22%, cair Rp730.000 | total Rp1.110.000 | 12 cicilan. Opsional B 2,6jt: UTJ 11%, cair Rp2.184.000</w:t>
       </w:r>
     </w:p>
     <w:p>
@@ -1550,7 +1550,7 @@
           <w:i w:val="0"/>
           <w:sz w:val="22"/>
         </w:rPr>
-        <w:t>☐  Admin: input pinjaman pending + tampilkan fee 11/5/22 &amp; cair 73%</w:t>
+        <w:t>☐  Admin: input pinjaman pending + tampilkan fee tier (plafon max 2,5jt: 11/5/22 cair 73%; min 2,6jt: 11/5/11 cair 84%)</w:t>
       </w:r>
     </w:p>
     <w:p>
@@ -4078,7 +4078,9 @@
             <w:tcW w:type="dxa" w:w="2268"/>
           </w:tcPr>
           <w:p>
-            <w:r/>
+            <w:r>
+              <w:t>Fee admin 5%, UTJ 22%, angsuran 11%, cair 730rb; pending</w:t>
+            </w:r>
             <w:r>
               <w:rPr>
                 <w:rFonts w:ascii="Times New Roman" w:hAnsi="Times New Roman" w:eastAsia="Times New Roman"/>
@@ -4086,7 +4088,6 @@
                 <w:i w:val="0"/>
                 <w:sz w:val="16"/>
               </w:rPr>
-              <w:t>Fee 5/22/11; cair 730rb; pending</w:t>
             </w:r>
           </w:p>
         </w:tc>
@@ -4136,6 +4137,62 @@
                 <w:sz w:val="16"/>
               </w:rPr>
             </w:r>
+          </w:p>
+        </w:tc>
+      </w:tr>
+      <w:tr>
+        <w:tc>
+          <w:tcPr>
+            <w:tcW w:type="dxa" w:w="1662"/>
+          </w:tcPr>
+          <w:p>
+            <w:r>
+              <w:t>ln-01b</w:t>
+            </w:r>
+          </w:p>
+        </w:tc>
+        <w:tc>
+          <w:tcPr>
+            <w:tcW w:type="dxa" w:w="1662"/>
+          </w:tcPr>
+          <w:p>
+            <w:r>
+              <w:t>Input 2,6jt, 3 bln, weekly</w:t>
+            </w:r>
+          </w:p>
+        </w:tc>
+        <w:tc>
+          <w:tcPr>
+            <w:tcW w:type="dxa" w:w="1662"/>
+          </w:tcPr>
+          <w:p>
+            <w:r>
+              <w:t>Fee admin 5%, UTJ 11%, angsuran 11%, cair 2.184jt; pending</w:t>
+            </w:r>
+          </w:p>
+        </w:tc>
+        <w:tc>
+          <w:tcPr>
+            <w:tcW w:type="dxa" w:w="1662"/>
+          </w:tcPr>
+          <w:p>
+            <w:r/>
+          </w:p>
+        </w:tc>
+        <w:tc>
+          <w:tcPr>
+            <w:tcW w:type="dxa" w:w="1662"/>
+          </w:tcPr>
+          <w:p>
+            <w:r/>
+          </w:p>
+        </w:tc>
+        <w:tc>
+          <w:tcPr>
+            <w:tcW w:type="dxa" w:w="1662"/>
+          </w:tcPr>
+          <w:p>
+            <w:r/>
           </w:p>
         </w:tc>
       </w:tr>

</xml_diff>

<commit_message>
docs: revisi BAB 4 + dokumentasi UAT blackbox (siklus 1-2, bukti screenshot, diagram activity/sequence/ERD, runbook UAT)
</commit_message>
<xml_diff>
--- a/CHECKLIST_DEMO_BLACKBOX.docx
+++ b/CHECKLIST_DEMO_BLACKBOX.docx
@@ -314,15 +314,8 @@
             <w:tcW w:type="dxa" w:w="3402"/>
           </w:tcPr>
           <w:p>
-            <w:r/>
-            <w:r>
-              <w:rPr>
-                <w:rFonts w:ascii="Times New Roman" w:hAnsi="Times New Roman" w:eastAsia="Times New Roman"/>
-                <w:b w:val="0"/>
-                <w:i w:val="0"/>
-                <w:sz w:val="18"/>
-              </w:rPr>
-              <w:t>Form terpisah: PANDUAN_DAN_FORM_PENGUJIAN</w:t>
+            <w:r>
+              <w:t>Form terpisah: FORM_UAT_KARYA_TANTRI_ABADI.docx / PANDUAN_DAN_FORM_PENGUJIAN</w:t>
             </w:r>
           </w:p>
         </w:tc>
@@ -5219,7 +5212,7 @@
           <w:i w:val="0"/>
           <w:sz w:val="20"/>
         </w:rPr>
-        <w:t>Ringkas 3.3: Lulus ____ / 11   |   TL ____   |   Bug ____</w:t>
+        <w:t>Ringkas 3.3: Lulus ____ / 12  (termasuk ln-01b)   |   TL ____   |   Bug ____</w:t>
       </w:r>
     </w:p>
     <w:p>
@@ -6294,15 +6287,8 @@
             <w:tcW w:type="dxa" w:w="1417"/>
           </w:tcPr>
           <w:p>
-            <w:r/>
-            <w:r>
-              <w:rPr>
-                <w:rFonts w:ascii="Times New Roman" w:hAnsi="Times New Roman" w:eastAsia="Times New Roman"/>
-                <w:b w:val="0"/>
-                <w:i w:val="0"/>
-                <w:sz w:val="20"/>
-              </w:rPr>
-              <w:t>11</w:t>
+            <w:r>
+              <w:t>12</w:t>
             </w:r>
           </w:p>
         </w:tc>
@@ -6494,15 +6480,8 @@
             <w:tcW w:type="dxa" w:w="1417"/>
           </w:tcPr>
           <w:p>
-            <w:r/>
-            <w:r>
-              <w:rPr>
-                <w:rFonts w:ascii="Times New Roman" w:hAnsi="Times New Roman" w:eastAsia="Times New Roman"/>
-                <w:b w:val="0"/>
-                <w:i w:val="0"/>
-                <w:sz w:val="20"/>
-              </w:rPr>
-              <w:t>30</w:t>
+            <w:r>
+              <w:t>31</w:t>
             </w:r>
           </w:p>
         </w:tc>
@@ -7381,7 +7360,7 @@
           <w:i w:val="0"/>
           <w:sz w:val="20"/>
         </w:rPr>
-        <w:t>Pengujian fungsional menggunakan metode Black Box Testing dengan teknik ECP, BVA, dan Error Guessing. Sebanyak 30 kasus uji dijalankan pada modul autentikasi (tanpa CAPTCHA), tabungan, pinjaman kelompok, laporan, dan batasan scope. Hasil rekap menunjukkan ___ kasus lulus (___%), ___ tidak lulus, dan ___ bug minor. Temuan utama kemudian ditindaklanjuti pada tahap revisi produk sesuai siklus R&amp;D.</w:t>
+        <w:t>Pengujian fungsional menggunakan metode Black Box Testing dengan teknik ECP, BVA, dan Error Guessing. Sebanyak 31 kasus uji dijalankan pada modul autentikasi (tanpa CAPTCHA), tabungan, pinjaman kelompok, laporan, dan batasan scope. Hasil rekap menunjukkan ___ kasus lulus (___%), ___ tidak lulus, dan ___ bug minor. Temuan utama kemudian ditindaklanjuti pada tahap revisi produk sesuai siklus R&amp;D.</w:t>
       </w:r>
     </w:p>
     <w:p>

</xml_diff>